<commit_message>
Enhance Makefile to build all targets
</commit_message>
<xml_diff>
--- a/dist/Torsten Uhlmann Lebenslauf Styled.docx
+++ b/dist/Torsten Uhlmann Lebenslauf Styled.docx
@@ -3572,7 +3572,7 @@
         <w:t>BibleTime</w:t>
       </w:r>
       <w:r>
-        <w:t xml:space="preserve"> — Bibelstudiensoftware für Unix und KDE. Das Projekt besteht aus mehreren Entwicklern, Übersetzern und Testern. Von mir initiiert und als Koordinator geleitet.</w:t>
+        <w:t xml:space="preserve"> — Bibelstudiensoftware für Unix und KDE. Das Projekt besteht aus mehreren Entwicklern, Übersetzern und Testern. Von mir initiiert und anfänglich geleitet.</w:t>
       </w:r>
     </w:p>
     <w:p>
@@ -3643,7 +3643,7 @@
           <w:color w:val="95A5A6"/>
           <w:sz w:val="16"/>
         </w:rPr>
-        <w:t>agynamix.de/de/resume | Stand: März 2026</w:t>
+        <w:t>agynamix.de/de/resume</w:t>
       </w:r>
     </w:p>
     <w:sectPr>

</xml_diff>